<commit_message>
Cập nhật báo cáo tuần
</commit_message>
<xml_diff>
--- a/BaoCaoTuan.docx
+++ b/BaoCaoTuan.docx
@@ -6,16 +6,16 @@
       <w:pPr>
         <w:rPr>
           <w:rFonts w:ascii="Times New Roman" w:hAnsi="Times New Roman" w:cs="Times New Roman"/>
-          <w:sz w:val="26"/>
-          <w:szCs w:val="26"/>
-          <w:lang w:val="vi-VN"/>
-        </w:rPr>
-      </w:pPr>
-      <w:r>
-        <w:rPr>
-          <w:rFonts w:ascii="Times New Roman" w:hAnsi="Times New Roman" w:cs="Times New Roman"/>
-          <w:sz w:val="26"/>
-          <w:szCs w:val="26"/>
+          <w:sz w:val="28"/>
+          <w:szCs w:val="28"/>
+          <w:lang w:val="vi-VN"/>
+        </w:rPr>
+      </w:pPr>
+      <w:r>
+        <w:rPr>
+          <w:rFonts w:ascii="Times New Roman" w:hAnsi="Times New Roman" w:cs="Times New Roman"/>
+          <w:sz w:val="28"/>
+          <w:szCs w:val="28"/>
           <w:lang w:val="vi-VN"/>
         </w:rPr>
         <w:t xml:space="preserve">Báo cáo Tuần 1: </w:t>
@@ -25,16 +25,16 @@
       <w:pPr>
         <w:rPr>
           <w:rFonts w:ascii="Times New Roman" w:hAnsi="Times New Roman" w:cs="Times New Roman"/>
-          <w:sz w:val="26"/>
-          <w:szCs w:val="26"/>
-          <w:lang w:val="vi-VN"/>
-        </w:rPr>
-      </w:pPr>
-      <w:r>
-        <w:rPr>
-          <w:rFonts w:ascii="Times New Roman" w:hAnsi="Times New Roman" w:cs="Times New Roman"/>
-          <w:sz w:val="26"/>
-          <w:szCs w:val="26"/>
+          <w:sz w:val="28"/>
+          <w:szCs w:val="28"/>
+          <w:lang w:val="vi-VN"/>
+        </w:rPr>
+      </w:pPr>
+      <w:r>
+        <w:rPr>
+          <w:rFonts w:ascii="Times New Roman" w:hAnsi="Times New Roman" w:cs="Times New Roman"/>
+          <w:sz w:val="28"/>
+          <w:szCs w:val="28"/>
           <w:lang w:val="vi-VN"/>
         </w:rPr>
         <w:t xml:space="preserve">Trong tuần này em biết thêm được : </w:t>
@@ -49,16 +49,16 @@
         </w:numPr>
         <w:rPr>
           <w:rFonts w:ascii="Times New Roman" w:hAnsi="Times New Roman" w:cs="Times New Roman"/>
-          <w:sz w:val="26"/>
-          <w:szCs w:val="26"/>
-          <w:lang w:val="vi-VN"/>
-        </w:rPr>
-      </w:pPr>
-      <w:r>
-        <w:rPr>
-          <w:rFonts w:ascii="Times New Roman" w:hAnsi="Times New Roman" w:cs="Times New Roman"/>
-          <w:sz w:val="26"/>
-          <w:szCs w:val="26"/>
+          <w:sz w:val="28"/>
+          <w:szCs w:val="28"/>
+          <w:lang w:val="vi-VN"/>
+        </w:rPr>
+      </w:pPr>
+      <w:r>
+        <w:rPr>
+          <w:rFonts w:ascii="Times New Roman" w:hAnsi="Times New Roman" w:cs="Times New Roman"/>
+          <w:sz w:val="28"/>
+          <w:szCs w:val="28"/>
           <w:lang w:val="vi-VN"/>
         </w:rPr>
         <w:t xml:space="preserve">Chọn đề tài, khái quát sơ về đề tài </w:t>
@@ -73,16 +73,16 @@
         </w:numPr>
         <w:rPr>
           <w:rFonts w:ascii="Times New Roman" w:hAnsi="Times New Roman" w:cs="Times New Roman"/>
-          <w:sz w:val="26"/>
-          <w:szCs w:val="26"/>
-          <w:lang w:val="vi-VN"/>
-        </w:rPr>
-      </w:pPr>
-      <w:r>
-        <w:rPr>
-          <w:rFonts w:ascii="Times New Roman" w:hAnsi="Times New Roman" w:cs="Times New Roman"/>
-          <w:sz w:val="26"/>
-          <w:szCs w:val="26"/>
+          <w:sz w:val="28"/>
+          <w:szCs w:val="28"/>
+          <w:lang w:val="vi-VN"/>
+        </w:rPr>
+      </w:pPr>
+      <w:r>
+        <w:rPr>
+          <w:rFonts w:ascii="Times New Roman" w:hAnsi="Times New Roman" w:cs="Times New Roman"/>
+          <w:sz w:val="28"/>
+          <w:szCs w:val="28"/>
           <w:lang w:val="vi-VN"/>
         </w:rPr>
         <w:t>Chọn công nghệ để thực hiện dự án ( Laravel, wamp)</w:t>
@@ -92,16 +92,16 @@
       <w:pPr>
         <w:rPr>
           <w:rFonts w:ascii="Times New Roman" w:hAnsi="Times New Roman" w:cs="Times New Roman"/>
-          <w:sz w:val="26"/>
-          <w:szCs w:val="26"/>
-          <w:lang w:val="vi-VN"/>
-        </w:rPr>
-      </w:pPr>
-      <w:r>
-        <w:rPr>
-          <w:rFonts w:ascii="Times New Roman" w:hAnsi="Times New Roman" w:cs="Times New Roman"/>
-          <w:sz w:val="26"/>
-          <w:szCs w:val="26"/>
+          <w:sz w:val="28"/>
+          <w:szCs w:val="28"/>
+          <w:lang w:val="vi-VN"/>
+        </w:rPr>
+      </w:pPr>
+      <w:r>
+        <w:rPr>
+          <w:rFonts w:ascii="Times New Roman" w:hAnsi="Times New Roman" w:cs="Times New Roman"/>
+          <w:sz w:val="28"/>
+          <w:szCs w:val="28"/>
           <w:lang w:val="vi-VN"/>
         </w:rPr>
         <w:t>Báo cáo Tuần 2:</w:t>
@@ -111,16 +111,16 @@
       <w:pPr>
         <w:rPr>
           <w:rFonts w:ascii="Times New Roman" w:hAnsi="Times New Roman" w:cs="Times New Roman"/>
-          <w:sz w:val="26"/>
-          <w:szCs w:val="26"/>
-          <w:lang w:val="vi-VN"/>
-        </w:rPr>
-      </w:pPr>
-      <w:r>
-        <w:rPr>
-          <w:rFonts w:ascii="Times New Roman" w:hAnsi="Times New Roman" w:cs="Times New Roman"/>
-          <w:sz w:val="26"/>
-          <w:szCs w:val="26"/>
+          <w:sz w:val="28"/>
+          <w:szCs w:val="28"/>
+          <w:lang w:val="vi-VN"/>
+        </w:rPr>
+      </w:pPr>
+      <w:r>
+        <w:rPr>
+          <w:rFonts w:ascii="Times New Roman" w:hAnsi="Times New Roman" w:cs="Times New Roman"/>
+          <w:sz w:val="28"/>
+          <w:szCs w:val="28"/>
           <w:lang w:val="vi-VN"/>
         </w:rPr>
         <w:t>Trong tuần này em biết thêm được:</w:t>
@@ -135,16 +135,16 @@
         </w:numPr>
         <w:rPr>
           <w:rFonts w:ascii="Times New Roman" w:hAnsi="Times New Roman" w:cs="Times New Roman"/>
-          <w:sz w:val="26"/>
-          <w:szCs w:val="26"/>
-          <w:lang w:val="vi-VN"/>
-        </w:rPr>
-      </w:pPr>
-      <w:r>
-        <w:rPr>
-          <w:rFonts w:ascii="Times New Roman" w:hAnsi="Times New Roman" w:cs="Times New Roman"/>
-          <w:sz w:val="26"/>
-          <w:szCs w:val="26"/>
+          <w:sz w:val="28"/>
+          <w:szCs w:val="28"/>
+          <w:lang w:val="vi-VN"/>
+        </w:rPr>
+      </w:pPr>
+      <w:r>
+        <w:rPr>
+          <w:rFonts w:ascii="Times New Roman" w:hAnsi="Times New Roman" w:cs="Times New Roman"/>
+          <w:sz w:val="28"/>
+          <w:szCs w:val="28"/>
           <w:lang w:val="vi-VN"/>
         </w:rPr>
         <w:t>Tìm hiếu sử dụng git, git-bash</w:t>
@@ -159,16 +159,16 @@
         </w:numPr>
         <w:rPr>
           <w:rFonts w:ascii="Times New Roman" w:hAnsi="Times New Roman" w:cs="Times New Roman"/>
-          <w:sz w:val="26"/>
-          <w:szCs w:val="26"/>
-          <w:lang w:val="vi-VN"/>
-        </w:rPr>
-      </w:pPr>
-      <w:r>
-        <w:rPr>
-          <w:rFonts w:ascii="Times New Roman" w:hAnsi="Times New Roman" w:cs="Times New Roman"/>
-          <w:sz w:val="26"/>
-          <w:szCs w:val="26"/>
+          <w:sz w:val="28"/>
+          <w:szCs w:val="28"/>
+          <w:lang w:val="vi-VN"/>
+        </w:rPr>
+      </w:pPr>
+      <w:r>
+        <w:rPr>
+          <w:rFonts w:ascii="Times New Roman" w:hAnsi="Times New Roman" w:cs="Times New Roman"/>
+          <w:sz w:val="28"/>
+          <w:szCs w:val="28"/>
           <w:lang w:val="vi-VN"/>
         </w:rPr>
         <w:t xml:space="preserve">Tạo được repo trong github </w:t>
@@ -178,16 +178,16 @@
       <w:pPr>
         <w:rPr>
           <w:rFonts w:ascii="Times New Roman" w:hAnsi="Times New Roman" w:cs="Times New Roman"/>
-          <w:sz w:val="26"/>
-          <w:szCs w:val="26"/>
-          <w:lang w:val="vi-VN"/>
-        </w:rPr>
-      </w:pPr>
-      <w:r>
-        <w:rPr>
-          <w:rFonts w:ascii="Times New Roman" w:hAnsi="Times New Roman" w:cs="Times New Roman"/>
-          <w:sz w:val="26"/>
-          <w:szCs w:val="26"/>
+          <w:sz w:val="28"/>
+          <w:szCs w:val="28"/>
+          <w:lang w:val="vi-VN"/>
+        </w:rPr>
+      </w:pPr>
+      <w:r>
+        <w:rPr>
+          <w:rFonts w:ascii="Times New Roman" w:hAnsi="Times New Roman" w:cs="Times New Roman"/>
+          <w:sz w:val="28"/>
+          <w:szCs w:val="28"/>
           <w:lang w:val="vi-VN"/>
         </w:rPr>
         <w:t>Báo cáo Tuần 3:</w:t>
@@ -197,16 +197,16 @@
       <w:pPr>
         <w:rPr>
           <w:rFonts w:ascii="Times New Roman" w:hAnsi="Times New Roman" w:cs="Times New Roman"/>
-          <w:sz w:val="26"/>
-          <w:szCs w:val="26"/>
-          <w:lang w:val="vi-VN"/>
-        </w:rPr>
-      </w:pPr>
-      <w:r>
-        <w:rPr>
-          <w:rFonts w:ascii="Times New Roman" w:hAnsi="Times New Roman" w:cs="Times New Roman"/>
-          <w:sz w:val="26"/>
-          <w:szCs w:val="26"/>
+          <w:sz w:val="28"/>
+          <w:szCs w:val="28"/>
+          <w:lang w:val="vi-VN"/>
+        </w:rPr>
+      </w:pPr>
+      <w:r>
+        <w:rPr>
+          <w:rFonts w:ascii="Times New Roman" w:hAnsi="Times New Roman" w:cs="Times New Roman"/>
+          <w:sz w:val="28"/>
+          <w:szCs w:val="28"/>
           <w:lang w:val="vi-VN"/>
         </w:rPr>
         <w:t>Trong tuần này em biết thêm được:</w:t>
@@ -221,16 +221,16 @@
         </w:numPr>
         <w:rPr>
           <w:rFonts w:ascii="Times New Roman" w:hAnsi="Times New Roman" w:cs="Times New Roman"/>
-          <w:sz w:val="26"/>
-          <w:szCs w:val="26"/>
-          <w:lang w:val="vi-VN"/>
-        </w:rPr>
-      </w:pPr>
-      <w:r>
-        <w:rPr>
-          <w:rFonts w:ascii="Times New Roman" w:hAnsi="Times New Roman" w:cs="Times New Roman"/>
-          <w:sz w:val="26"/>
-          <w:szCs w:val="26"/>
+          <w:sz w:val="28"/>
+          <w:szCs w:val="28"/>
+          <w:lang w:val="vi-VN"/>
+        </w:rPr>
+      </w:pPr>
+      <w:r>
+        <w:rPr>
+          <w:rFonts w:ascii="Times New Roman" w:hAnsi="Times New Roman" w:cs="Times New Roman"/>
+          <w:sz w:val="28"/>
+          <w:szCs w:val="28"/>
           <w:lang w:val="vi-VN"/>
         </w:rPr>
         <w:t>Tạo được layout</w:t>
@@ -245,16 +245,16 @@
         </w:numPr>
         <w:rPr>
           <w:rFonts w:ascii="Times New Roman" w:hAnsi="Times New Roman" w:cs="Times New Roman"/>
-          <w:sz w:val="26"/>
-          <w:szCs w:val="26"/>
-          <w:lang w:val="vi-VN"/>
-        </w:rPr>
-      </w:pPr>
-      <w:r>
-        <w:rPr>
-          <w:rFonts w:ascii="Times New Roman" w:hAnsi="Times New Roman" w:cs="Times New Roman"/>
-          <w:sz w:val="26"/>
-          <w:szCs w:val="26"/>
+          <w:sz w:val="28"/>
+          <w:szCs w:val="28"/>
+          <w:lang w:val="vi-VN"/>
+        </w:rPr>
+      </w:pPr>
+      <w:r>
+        <w:rPr>
+          <w:rFonts w:ascii="Times New Roman" w:hAnsi="Times New Roman" w:cs="Times New Roman"/>
+          <w:sz w:val="28"/>
+          <w:szCs w:val="28"/>
           <w:lang w:val="vi-VN"/>
         </w:rPr>
         <w:t>Chọn template phù hợp với đề tài</w:t>
@@ -269,16 +269,16 @@
         </w:numPr>
         <w:rPr>
           <w:rFonts w:ascii="Times New Roman" w:hAnsi="Times New Roman" w:cs="Times New Roman"/>
-          <w:sz w:val="26"/>
-          <w:szCs w:val="26"/>
-          <w:lang w:val="vi-VN"/>
-        </w:rPr>
-      </w:pPr>
-      <w:r>
-        <w:rPr>
-          <w:rFonts w:ascii="Times New Roman" w:hAnsi="Times New Roman" w:cs="Times New Roman"/>
-          <w:sz w:val="26"/>
-          <w:szCs w:val="26"/>
+          <w:sz w:val="28"/>
+          <w:szCs w:val="28"/>
+          <w:lang w:val="vi-VN"/>
+        </w:rPr>
+      </w:pPr>
+      <w:r>
+        <w:rPr>
+          <w:rFonts w:ascii="Times New Roman" w:hAnsi="Times New Roman" w:cs="Times New Roman"/>
+          <w:sz w:val="28"/>
+          <w:szCs w:val="28"/>
           <w:lang w:val="vi-VN"/>
         </w:rPr>
         <w:t>Biết cách chạy web bằng localhost</w:t>
@@ -293,16 +293,16 @@
         </w:numPr>
         <w:rPr>
           <w:rFonts w:ascii="Times New Roman" w:hAnsi="Times New Roman" w:cs="Times New Roman"/>
-          <w:sz w:val="26"/>
-          <w:szCs w:val="26"/>
-          <w:lang w:val="vi-VN"/>
-        </w:rPr>
-      </w:pPr>
-      <w:r>
-        <w:rPr>
-          <w:rFonts w:ascii="Times New Roman" w:hAnsi="Times New Roman" w:cs="Times New Roman"/>
-          <w:sz w:val="26"/>
-          <w:szCs w:val="26"/>
+          <w:sz w:val="28"/>
+          <w:szCs w:val="28"/>
+          <w:lang w:val="vi-VN"/>
+        </w:rPr>
+      </w:pPr>
+      <w:r>
+        <w:rPr>
+          <w:rFonts w:ascii="Times New Roman" w:hAnsi="Times New Roman" w:cs="Times New Roman"/>
+          <w:sz w:val="28"/>
+          <w:szCs w:val="28"/>
           <w:lang w:val="vi-VN"/>
         </w:rPr>
         <w:t>Nắm rõ các thao tác trong gitbash và up bài lên github</w:t>
@@ -312,270 +312,390 @@
       <w:pPr>
         <w:rPr>
           <w:rFonts w:ascii="Times New Roman" w:hAnsi="Times New Roman" w:cs="Times New Roman"/>
-          <w:sz w:val="26"/>
-          <w:szCs w:val="26"/>
-          <w:lang w:val="vi-VN"/>
-        </w:rPr>
-      </w:pPr>
-      <w:r>
-        <w:rPr>
-          <w:rFonts w:ascii="Times New Roman" w:hAnsi="Times New Roman" w:cs="Times New Roman"/>
-          <w:sz w:val="26"/>
-          <w:szCs w:val="26"/>
+          <w:sz w:val="28"/>
+          <w:szCs w:val="28"/>
+          <w:lang w:val="vi-VN"/>
+        </w:rPr>
+      </w:pPr>
+      <w:r>
+        <w:rPr>
+          <w:rFonts w:ascii="Times New Roman" w:hAnsi="Times New Roman" w:cs="Times New Roman"/>
+          <w:sz w:val="28"/>
+          <w:szCs w:val="28"/>
           <w:lang w:val="vi-VN"/>
         </w:rPr>
         <w:t>Báo cáo tuần 4:</w:t>
+      </w:r>
+    </w:p>
+    <w:p>
+      <w:pPr>
+        <w:rPr>
+          <w:rFonts w:ascii="Times New Roman" w:hAnsi="Times New Roman" w:cs="Times New Roman"/>
+          <w:sz w:val="28"/>
+          <w:szCs w:val="28"/>
+          <w:lang w:val="vi-VN"/>
+        </w:rPr>
+      </w:pPr>
+      <w:r>
+        <w:rPr>
+          <w:rFonts w:ascii="Times New Roman" w:hAnsi="Times New Roman" w:cs="Times New Roman"/>
+          <w:sz w:val="28"/>
+          <w:szCs w:val="28"/>
+          <w:lang w:val="vi-VN"/>
+        </w:rPr>
+        <w:t>Trong tuần này em biết thêm được:</w:t>
+      </w:r>
+    </w:p>
+    <w:p>
+      <w:pPr>
+        <w:pStyle w:val="ListParagraph"/>
+        <w:numPr>
+          <w:ilvl w:val="0"/>
+          <w:numId w:val="1"/>
+        </w:numPr>
+        <w:rPr>
+          <w:rFonts w:ascii="Times New Roman" w:hAnsi="Times New Roman" w:cs="Times New Roman"/>
+          <w:sz w:val="28"/>
+          <w:szCs w:val="28"/>
+          <w:lang w:val="vi-VN"/>
+        </w:rPr>
+      </w:pPr>
+      <w:r>
+        <w:rPr>
+          <w:rFonts w:ascii="Times New Roman" w:hAnsi="Times New Roman" w:cs="Times New Roman"/>
+          <w:sz w:val="28"/>
+          <w:szCs w:val="28"/>
+          <w:lang w:val="vi-VN"/>
+        </w:rPr>
+        <w:t>Tạo được layout</w:t>
+      </w:r>
+    </w:p>
+    <w:p>
+      <w:pPr>
+        <w:pStyle w:val="ListParagraph"/>
+        <w:numPr>
+          <w:ilvl w:val="0"/>
+          <w:numId w:val="1"/>
+        </w:numPr>
+        <w:rPr>
+          <w:rFonts w:ascii="Times New Roman" w:hAnsi="Times New Roman" w:cs="Times New Roman"/>
+          <w:sz w:val="28"/>
+          <w:szCs w:val="28"/>
+          <w:lang w:val="vi-VN"/>
+        </w:rPr>
+      </w:pPr>
+      <w:r>
+        <w:rPr>
+          <w:rFonts w:ascii="Times New Roman" w:hAnsi="Times New Roman" w:cs="Times New Roman"/>
+          <w:sz w:val="28"/>
+          <w:szCs w:val="28"/>
+          <w:lang w:val="vi-VN"/>
+        </w:rPr>
+        <w:t>Biết thêm về kế thừa trong php</w:t>
+      </w:r>
+    </w:p>
+    <w:p>
+      <w:pPr>
+        <w:pStyle w:val="ListParagraph"/>
+        <w:numPr>
+          <w:ilvl w:val="0"/>
+          <w:numId w:val="1"/>
+        </w:numPr>
+        <w:rPr>
+          <w:rFonts w:ascii="Times New Roman" w:hAnsi="Times New Roman" w:cs="Times New Roman"/>
+          <w:sz w:val="28"/>
+          <w:szCs w:val="28"/>
+          <w:lang w:val="vi-VN"/>
+        </w:rPr>
+      </w:pPr>
+      <w:r>
+        <w:rPr>
+          <w:rFonts w:ascii="Times New Roman" w:hAnsi="Times New Roman" w:cs="Times New Roman"/>
+          <w:sz w:val="28"/>
+          <w:szCs w:val="28"/>
+          <w:lang w:val="vi-VN"/>
+        </w:rPr>
+        <w:t>Biết cách dẫn css, js….</w:t>
+      </w:r>
+    </w:p>
+    <w:p>
+      <w:pPr>
+        <w:pStyle w:val="ListParagraph"/>
+        <w:numPr>
+          <w:ilvl w:val="0"/>
+          <w:numId w:val="1"/>
+        </w:numPr>
+        <w:rPr>
+          <w:rFonts w:ascii="Times New Roman" w:hAnsi="Times New Roman" w:cs="Times New Roman"/>
+          <w:sz w:val="28"/>
+          <w:szCs w:val="28"/>
+          <w:lang w:val="vi-VN"/>
+        </w:rPr>
+      </w:pPr>
+      <w:r>
+        <w:rPr>
+          <w:rFonts w:ascii="Times New Roman" w:hAnsi="Times New Roman" w:cs="Times New Roman"/>
+          <w:sz w:val="28"/>
+          <w:szCs w:val="28"/>
+          <w:lang w:val="vi-VN"/>
+        </w:rPr>
+        <w:t xml:space="preserve">Xác định được template của shop và admin </w:t>
+      </w:r>
+    </w:p>
+    <w:p>
+      <w:pPr>
+        <w:rPr>
+          <w:rFonts w:ascii="Times New Roman" w:hAnsi="Times New Roman" w:cs="Times New Roman"/>
+          <w:sz w:val="28"/>
+          <w:szCs w:val="28"/>
+          <w:lang w:val="vi-VN"/>
+        </w:rPr>
+      </w:pPr>
+      <w:r>
+        <w:rPr>
+          <w:rFonts w:ascii="Times New Roman" w:hAnsi="Times New Roman" w:cs="Times New Roman"/>
+          <w:sz w:val="28"/>
+          <w:szCs w:val="28"/>
+          <w:lang w:val="vi-VN"/>
+        </w:rPr>
+        <w:t>Báo cáo tuần 5:</w:t>
+      </w:r>
+    </w:p>
+    <w:p>
+      <w:pPr>
+        <w:rPr>
+          <w:rFonts w:ascii="Times New Roman" w:hAnsi="Times New Roman" w:cs="Times New Roman"/>
+          <w:sz w:val="28"/>
+          <w:szCs w:val="28"/>
+          <w:lang w:val="vi-VN"/>
+        </w:rPr>
+      </w:pPr>
+      <w:r>
+        <w:rPr>
+          <w:rFonts w:ascii="Times New Roman" w:hAnsi="Times New Roman" w:cs="Times New Roman"/>
+          <w:sz w:val="28"/>
+          <w:szCs w:val="28"/>
+          <w:lang w:val="vi-VN"/>
+        </w:rPr>
+        <w:t>Trong tuần này em biết thêm được:</w:t>
+      </w:r>
+    </w:p>
+    <w:p>
+      <w:pPr>
+        <w:pStyle w:val="ListParagraph"/>
+        <w:numPr>
+          <w:ilvl w:val="0"/>
+          <w:numId w:val="1"/>
+        </w:numPr>
+        <w:rPr>
+          <w:rFonts w:ascii="Times New Roman" w:hAnsi="Times New Roman" w:cs="Times New Roman"/>
+          <w:sz w:val="28"/>
+          <w:szCs w:val="28"/>
+          <w:lang w:val="vi-VN"/>
+        </w:rPr>
+      </w:pPr>
+      <w:r>
+        <w:rPr>
+          <w:rFonts w:ascii="Times New Roman" w:hAnsi="Times New Roman" w:cs="Times New Roman"/>
+          <w:sz w:val="28"/>
+          <w:szCs w:val="28"/>
+          <w:lang w:val="vi-VN"/>
+        </w:rPr>
+        <w:t>Bổ sung thêm các sơ đồ DFD, ERD</w:t>
+      </w:r>
+    </w:p>
+    <w:p>
+      <w:pPr>
+        <w:pStyle w:val="ListParagraph"/>
+        <w:numPr>
+          <w:ilvl w:val="0"/>
+          <w:numId w:val="1"/>
+        </w:numPr>
+        <w:rPr>
+          <w:rFonts w:ascii="Times New Roman" w:hAnsi="Times New Roman" w:cs="Times New Roman"/>
+          <w:sz w:val="28"/>
+          <w:szCs w:val="28"/>
+          <w:lang w:val="vi-VN"/>
+        </w:rPr>
+      </w:pPr>
+      <w:r>
+        <w:rPr>
+          <w:rFonts w:ascii="Times New Roman" w:hAnsi="Times New Roman" w:cs="Times New Roman"/>
+          <w:sz w:val="28"/>
+          <w:szCs w:val="28"/>
+          <w:lang w:val="vi-VN"/>
+        </w:rPr>
+        <w:t>Hoàn thành được trang bìa, mục lục, lời cảm ơn, mô tả, lời kết</w:t>
+      </w:r>
+    </w:p>
+    <w:p>
+      <w:pPr>
+        <w:pStyle w:val="ListParagraph"/>
+        <w:numPr>
+          <w:ilvl w:val="0"/>
+          <w:numId w:val="1"/>
+        </w:numPr>
+        <w:rPr>
+          <w:rFonts w:ascii="Times New Roman" w:hAnsi="Times New Roman" w:cs="Times New Roman"/>
+          <w:sz w:val="28"/>
+          <w:szCs w:val="28"/>
+          <w:lang w:val="vi-VN"/>
+        </w:rPr>
+      </w:pPr>
+      <w:r>
+        <w:rPr>
+          <w:rFonts w:ascii="Times New Roman" w:hAnsi="Times New Roman" w:cs="Times New Roman"/>
+          <w:sz w:val="28"/>
+          <w:szCs w:val="28"/>
+          <w:lang w:val="vi-VN"/>
+        </w:rPr>
+        <w:t>Chỉnh lại giao diện rõ rang hơn</w:t>
+      </w:r>
+    </w:p>
+    <w:p>
+      <w:pPr>
+        <w:pStyle w:val="ListParagraph"/>
+        <w:numPr>
+          <w:ilvl w:val="0"/>
+          <w:numId w:val="1"/>
+        </w:numPr>
+        <w:rPr>
+          <w:rFonts w:ascii="Times New Roman" w:hAnsi="Times New Roman" w:cs="Times New Roman"/>
+          <w:sz w:val="28"/>
+          <w:szCs w:val="28"/>
+          <w:lang w:val="vi-VN"/>
+        </w:rPr>
+      </w:pPr>
+      <w:r>
+        <w:rPr>
+          <w:rFonts w:ascii="Times New Roman" w:hAnsi="Times New Roman" w:cs="Times New Roman"/>
+          <w:sz w:val="28"/>
+          <w:szCs w:val="28"/>
+          <w:lang w:val="vi-VN"/>
+        </w:rPr>
+        <w:t>Biết định dạng theo mẫu luận văn tốt nghiệp</w:t>
+      </w:r>
+    </w:p>
+    <w:p>
+      <w:pPr>
+        <w:rPr>
+          <w:rFonts w:ascii="Times New Roman" w:hAnsi="Times New Roman" w:cs="Times New Roman"/>
+          <w:sz w:val="28"/>
+          <w:szCs w:val="28"/>
+          <w:lang w:val="vi-VN"/>
+        </w:rPr>
+      </w:pPr>
+      <w:r>
+        <w:rPr>
+          <w:rFonts w:ascii="Times New Roman" w:hAnsi="Times New Roman" w:cs="Times New Roman"/>
+          <w:sz w:val="28"/>
+          <w:szCs w:val="28"/>
+          <w:lang w:val="vi-VN"/>
+        </w:rPr>
+        <w:t>Báo cáo tuần 6:</w:t>
+      </w:r>
+    </w:p>
+    <w:p>
+      <w:pPr>
+        <w:rPr>
+          <w:rFonts w:ascii="Times New Roman" w:hAnsi="Times New Roman" w:cs="Times New Roman"/>
+          <w:sz w:val="28"/>
+          <w:szCs w:val="28"/>
+          <w:lang w:val="vi-VN"/>
+        </w:rPr>
+      </w:pPr>
+      <w:r>
+        <w:rPr>
+          <w:rFonts w:ascii="Times New Roman" w:hAnsi="Times New Roman" w:cs="Times New Roman"/>
+          <w:sz w:val="28"/>
+          <w:szCs w:val="28"/>
+          <w:lang w:val="vi-VN"/>
+        </w:rPr>
+        <w:t>Trong tuần này em biết thêm được:</w:t>
+      </w:r>
+    </w:p>
+    <w:p>
+      <w:pPr>
+        <w:pStyle w:val="ListParagraph"/>
+        <w:numPr>
+          <w:ilvl w:val="0"/>
+          <w:numId w:val="1"/>
+        </w:numPr>
+        <w:rPr>
+          <w:rFonts w:ascii="Times New Roman" w:hAnsi="Times New Roman" w:cs="Times New Roman"/>
+          <w:sz w:val="28"/>
+          <w:szCs w:val="28"/>
+          <w:lang w:val="vi-VN"/>
+        </w:rPr>
+      </w:pPr>
+      <w:r>
+        <w:rPr>
+          <w:rFonts w:ascii="Times New Roman" w:hAnsi="Times New Roman" w:cs="Times New Roman"/>
+          <w:sz w:val="28"/>
+          <w:szCs w:val="28"/>
+          <w:lang w:val="vi-VN"/>
+        </w:rPr>
+        <w:t>Cách tạo login, logout</w:t>
       </w:r>
       <w:bookmarkStart w:id="0" w:name="_GoBack"/>
       <w:bookmarkEnd w:id="0"/>
     </w:p>
     <w:p>
       <w:pPr>
-        <w:rPr>
-          <w:rFonts w:ascii="Times New Roman" w:hAnsi="Times New Roman" w:cs="Times New Roman"/>
-          <w:sz w:val="26"/>
-          <w:szCs w:val="26"/>
-          <w:lang w:val="vi-VN"/>
-        </w:rPr>
-      </w:pPr>
-      <w:r>
-        <w:rPr>
-          <w:rFonts w:ascii="Times New Roman" w:hAnsi="Times New Roman" w:cs="Times New Roman"/>
-          <w:sz w:val="26"/>
-          <w:szCs w:val="26"/>
-          <w:lang w:val="vi-VN"/>
-        </w:rPr>
-        <w:t>Trong tuần này em biết thêm được:</w:t>
-      </w:r>
-    </w:p>
-    <w:p>
-      <w:pPr>
-        <w:pStyle w:val="ListParagraph"/>
-        <w:numPr>
-          <w:ilvl w:val="0"/>
-          <w:numId w:val="1"/>
-        </w:numPr>
-        <w:rPr>
-          <w:rFonts w:ascii="Times New Roman" w:hAnsi="Times New Roman" w:cs="Times New Roman"/>
-          <w:sz w:val="26"/>
-          <w:szCs w:val="26"/>
-          <w:lang w:val="vi-VN"/>
-        </w:rPr>
-      </w:pPr>
-      <w:r>
-        <w:rPr>
-          <w:rFonts w:ascii="Times New Roman" w:hAnsi="Times New Roman" w:cs="Times New Roman"/>
-          <w:sz w:val="26"/>
-          <w:szCs w:val="26"/>
-          <w:lang w:val="vi-VN"/>
-        </w:rPr>
-        <w:t>Tạo được layout</w:t>
-      </w:r>
-    </w:p>
-    <w:p>
-      <w:pPr>
-        <w:pStyle w:val="ListParagraph"/>
-        <w:numPr>
-          <w:ilvl w:val="0"/>
-          <w:numId w:val="1"/>
-        </w:numPr>
-        <w:rPr>
-          <w:rFonts w:ascii="Times New Roman" w:hAnsi="Times New Roman" w:cs="Times New Roman"/>
-          <w:sz w:val="26"/>
-          <w:szCs w:val="26"/>
-          <w:lang w:val="vi-VN"/>
-        </w:rPr>
-      </w:pPr>
-      <w:r>
-        <w:rPr>
-          <w:rFonts w:ascii="Times New Roman" w:hAnsi="Times New Roman" w:cs="Times New Roman"/>
-          <w:sz w:val="26"/>
-          <w:szCs w:val="26"/>
-          <w:lang w:val="vi-VN"/>
-        </w:rPr>
-        <w:t>Biết thêm về kế thừa trong php</w:t>
-      </w:r>
-    </w:p>
-    <w:p>
-      <w:pPr>
-        <w:pStyle w:val="ListParagraph"/>
-        <w:numPr>
-          <w:ilvl w:val="0"/>
-          <w:numId w:val="1"/>
-        </w:numPr>
-        <w:rPr>
-          <w:rFonts w:ascii="Times New Roman" w:hAnsi="Times New Roman" w:cs="Times New Roman"/>
-          <w:sz w:val="26"/>
-          <w:szCs w:val="26"/>
-          <w:lang w:val="vi-VN"/>
-        </w:rPr>
-      </w:pPr>
-      <w:r>
-        <w:rPr>
-          <w:rFonts w:ascii="Times New Roman" w:hAnsi="Times New Roman" w:cs="Times New Roman"/>
-          <w:sz w:val="26"/>
-          <w:szCs w:val="26"/>
-          <w:lang w:val="vi-VN"/>
-        </w:rPr>
-        <w:t>Biết cách dẫn css, js….</w:t>
-      </w:r>
-    </w:p>
-    <w:p>
-      <w:pPr>
-        <w:pStyle w:val="ListParagraph"/>
-        <w:numPr>
-          <w:ilvl w:val="0"/>
-          <w:numId w:val="1"/>
-        </w:numPr>
-        <w:rPr>
-          <w:rFonts w:ascii="Times New Roman" w:hAnsi="Times New Roman" w:cs="Times New Roman"/>
-          <w:sz w:val="26"/>
-          <w:szCs w:val="26"/>
-          <w:lang w:val="vi-VN"/>
-        </w:rPr>
-      </w:pPr>
-      <w:r>
-        <w:rPr>
-          <w:rFonts w:ascii="Times New Roman" w:hAnsi="Times New Roman" w:cs="Times New Roman"/>
-          <w:sz w:val="26"/>
-          <w:szCs w:val="26"/>
-          <w:lang w:val="vi-VN"/>
-        </w:rPr>
-        <w:t xml:space="preserve">Xác định được template của shop và admin </w:t>
-      </w:r>
-    </w:p>
-    <w:p>
-      <w:pPr>
-        <w:rPr>
-          <w:rFonts w:ascii="Times New Roman" w:hAnsi="Times New Roman" w:cs="Times New Roman"/>
-          <w:sz w:val="26"/>
-          <w:szCs w:val="26"/>
-          <w:lang w:val="vi-VN"/>
-        </w:rPr>
-      </w:pPr>
-      <w:r>
-        <w:rPr>
-          <w:rFonts w:ascii="Times New Roman" w:hAnsi="Times New Roman" w:cs="Times New Roman"/>
-          <w:sz w:val="26"/>
-          <w:szCs w:val="26"/>
-          <w:lang w:val="vi-VN"/>
-        </w:rPr>
-        <w:t>Báo cáo tuần 5:</w:t>
-      </w:r>
-    </w:p>
-    <w:p>
-      <w:pPr>
-        <w:rPr>
-          <w:rFonts w:ascii="Times New Roman" w:hAnsi="Times New Roman" w:cs="Times New Roman"/>
-          <w:sz w:val="26"/>
-          <w:szCs w:val="26"/>
-          <w:lang w:val="vi-VN"/>
-        </w:rPr>
-      </w:pPr>
-      <w:r>
-        <w:rPr>
-          <w:rFonts w:ascii="Times New Roman" w:hAnsi="Times New Roman" w:cs="Times New Roman"/>
-          <w:sz w:val="26"/>
-          <w:szCs w:val="26"/>
-          <w:lang w:val="vi-VN"/>
-        </w:rPr>
-        <w:t>Trong tuần này em biết thêm được:</w:t>
-      </w:r>
-    </w:p>
-    <w:p>
-      <w:pPr>
-        <w:pStyle w:val="ListParagraph"/>
-        <w:numPr>
-          <w:ilvl w:val="0"/>
-          <w:numId w:val="1"/>
-        </w:numPr>
-        <w:rPr>
-          <w:rFonts w:ascii="Times New Roman" w:hAnsi="Times New Roman" w:cs="Times New Roman"/>
-          <w:sz w:val="26"/>
-          <w:szCs w:val="26"/>
-          <w:lang w:val="vi-VN"/>
-        </w:rPr>
-      </w:pPr>
-      <w:r>
-        <w:rPr>
-          <w:rFonts w:ascii="Times New Roman" w:hAnsi="Times New Roman" w:cs="Times New Roman"/>
-          <w:sz w:val="26"/>
-          <w:szCs w:val="26"/>
-          <w:lang w:val="vi-VN"/>
-        </w:rPr>
-        <w:t>Bổ sung thêm các sơ đồ DFD, ERD</w:t>
-      </w:r>
-    </w:p>
-    <w:p>
-      <w:pPr>
-        <w:pStyle w:val="ListParagraph"/>
-        <w:numPr>
-          <w:ilvl w:val="0"/>
-          <w:numId w:val="1"/>
-        </w:numPr>
-        <w:rPr>
-          <w:rFonts w:ascii="Times New Roman" w:hAnsi="Times New Roman" w:cs="Times New Roman"/>
-          <w:sz w:val="26"/>
-          <w:szCs w:val="26"/>
-          <w:lang w:val="vi-VN"/>
-        </w:rPr>
-      </w:pPr>
-      <w:r>
-        <w:rPr>
-          <w:rFonts w:ascii="Times New Roman" w:hAnsi="Times New Roman" w:cs="Times New Roman"/>
-          <w:sz w:val="26"/>
-          <w:szCs w:val="26"/>
-          <w:lang w:val="vi-VN"/>
-        </w:rPr>
-        <w:t>Hoàn thành được trang bìa, mục lục, lời cảm ơn, mô tả, lời kết</w:t>
-      </w:r>
-    </w:p>
-    <w:p>
-      <w:pPr>
-        <w:pStyle w:val="ListParagraph"/>
-        <w:numPr>
-          <w:ilvl w:val="0"/>
-          <w:numId w:val="1"/>
-        </w:numPr>
-        <w:rPr>
-          <w:rFonts w:ascii="Times New Roman" w:hAnsi="Times New Roman" w:cs="Times New Roman"/>
-          <w:sz w:val="26"/>
-          <w:szCs w:val="26"/>
-          <w:lang w:val="vi-VN"/>
-        </w:rPr>
-      </w:pPr>
-      <w:r>
-        <w:rPr>
-          <w:rFonts w:ascii="Times New Roman" w:hAnsi="Times New Roman" w:cs="Times New Roman"/>
-          <w:sz w:val="26"/>
-          <w:szCs w:val="26"/>
-          <w:lang w:val="vi-VN"/>
-        </w:rPr>
-        <w:t>Chỉnh lại giao diện rõ rang hơn</w:t>
-      </w:r>
-    </w:p>
-    <w:p>
-      <w:pPr>
-        <w:pStyle w:val="ListParagraph"/>
-        <w:numPr>
-          <w:ilvl w:val="0"/>
-          <w:numId w:val="1"/>
-        </w:numPr>
-        <w:rPr>
-          <w:rFonts w:ascii="Times New Roman" w:hAnsi="Times New Roman" w:cs="Times New Roman"/>
-          <w:sz w:val="26"/>
-          <w:szCs w:val="26"/>
-          <w:lang w:val="vi-VN"/>
-        </w:rPr>
-      </w:pPr>
-      <w:r>
-        <w:rPr>
-          <w:rFonts w:ascii="Times New Roman" w:hAnsi="Times New Roman" w:cs="Times New Roman"/>
-          <w:sz w:val="26"/>
-          <w:szCs w:val="26"/>
-          <w:lang w:val="vi-VN"/>
-        </w:rPr>
-        <w:t>Biết định dạng theo mẫu luận văn tốt nghiệp</w:t>
+        <w:pStyle w:val="ListParagraph"/>
+        <w:numPr>
+          <w:ilvl w:val="0"/>
+          <w:numId w:val="1"/>
+        </w:numPr>
+        <w:rPr>
+          <w:rFonts w:ascii="Times New Roman" w:hAnsi="Times New Roman" w:cs="Times New Roman"/>
+          <w:sz w:val="28"/>
+          <w:szCs w:val="28"/>
+          <w:lang w:val="vi-VN"/>
+        </w:rPr>
+      </w:pPr>
+      <w:r>
+        <w:rPr>
+          <w:rFonts w:ascii="Times New Roman" w:hAnsi="Times New Roman" w:cs="Times New Roman"/>
+          <w:sz w:val="28"/>
+          <w:szCs w:val="28"/>
+          <w:lang w:val="vi-VN"/>
+        </w:rPr>
+        <w:lastRenderedPageBreak/>
+        <w:t>Sử dụng các câu lệnh : php artisan make:migration create_categories_table , php artisan make:migration create_products_table, php artisan make:controller admin/CategoryController ……</w:t>
+      </w:r>
+    </w:p>
+    <w:p>
+      <w:pPr>
+        <w:pStyle w:val="ListParagraph"/>
+        <w:numPr>
+          <w:ilvl w:val="0"/>
+          <w:numId w:val="1"/>
+        </w:numPr>
+        <w:rPr>
+          <w:rFonts w:ascii="Times New Roman" w:hAnsi="Times New Roman" w:cs="Times New Roman"/>
+          <w:sz w:val="28"/>
+          <w:szCs w:val="28"/>
+          <w:lang w:val="vi-VN"/>
+        </w:rPr>
+      </w:pPr>
+      <w:r>
+        <w:rPr>
+          <w:rFonts w:ascii="Times New Roman" w:hAnsi="Times New Roman" w:cs="Times New Roman"/>
+          <w:sz w:val="28"/>
+          <w:szCs w:val="28"/>
+          <w:lang w:val="vi-VN"/>
+        </w:rPr>
+        <w:t xml:space="preserve">Biết cách </w:t>
+      </w:r>
+      <w:r>
+        <w:rPr>
+          <w:rFonts w:ascii="Times New Roman" w:hAnsi="Times New Roman" w:cs="Times New Roman"/>
+          <w:sz w:val="28"/>
+          <w:szCs w:val="28"/>
+          <w:lang w:val="vi-VN"/>
+        </w:rPr>
+        <w:t xml:space="preserve"> truy vấn dữ liệu từ bảng trong database</w:t>
       </w:r>
     </w:p>
     <w:sectPr>

</xml_diff>